<commit_message>
Fix: printer automaticlly skip empty page
</commit_message>
<xml_diff>
--- a/test/test.docx
+++ b/test/test.docx
@@ -14,7 +14,21 @@
           <w:sz w:val="56"/>
           <w:szCs w:val="56"/>
         </w:rPr>
-        <w:t>THIS IS A TEST AND HAVE 5 PAGES</w:t>
+        <w:t xml:space="preserve">THIS IS A TEST AND HAVE </w:t>
+      </w:r>
+      <w:r>
+        <w:rPr>
+          <w:sz w:val="56"/>
+          <w:szCs w:val="56"/>
+        </w:rPr>
+        <w:t>2</w:t>
+      </w:r>
+      <w:r>
+        <w:rPr>
+          <w:sz w:val="56"/>
+          <w:szCs w:val="56"/>
+        </w:rPr>
+        <w:t xml:space="preserve"> PAGES</w:t>
       </w:r>
     </w:p>
     <w:p>
@@ -39,6 +53,93 @@
           <w:szCs w:val="56"/>
         </w:rPr>
       </w:pPr>
+    </w:p>
+    <w:p>
+      <w:pPr>
+        <w:rPr>
+          <w:sz w:val="56"/>
+          <w:szCs w:val="56"/>
+        </w:rPr>
+      </w:pPr>
+    </w:p>
+    <w:p>
+      <w:pPr>
+        <w:rPr>
+          <w:sz w:val="56"/>
+          <w:szCs w:val="56"/>
+        </w:rPr>
+      </w:pPr>
+    </w:p>
+    <w:p>
+      <w:pPr>
+        <w:rPr>
+          <w:sz w:val="56"/>
+          <w:szCs w:val="56"/>
+        </w:rPr>
+      </w:pPr>
+    </w:p>
+    <w:p>
+      <w:pPr>
+        <w:rPr>
+          <w:sz w:val="56"/>
+          <w:szCs w:val="56"/>
+        </w:rPr>
+      </w:pPr>
+    </w:p>
+    <w:p>
+      <w:pPr>
+        <w:rPr>
+          <w:sz w:val="56"/>
+          <w:szCs w:val="56"/>
+        </w:rPr>
+      </w:pPr>
+    </w:p>
+    <w:p>
+      <w:pPr>
+        <w:rPr>
+          <w:sz w:val="56"/>
+          <w:szCs w:val="56"/>
+        </w:rPr>
+      </w:pPr>
+    </w:p>
+    <w:p>
+      <w:pPr>
+        <w:rPr>
+          <w:sz w:val="56"/>
+          <w:szCs w:val="56"/>
+        </w:rPr>
+      </w:pPr>
+    </w:p>
+    <w:p>
+      <w:pPr>
+        <w:rPr>
+          <w:sz w:val="56"/>
+          <w:szCs w:val="56"/>
+        </w:rPr>
+      </w:pPr>
+    </w:p>
+    <w:p>
+      <w:pPr>
+        <w:rPr>
+          <w:sz w:val="56"/>
+          <w:szCs w:val="56"/>
+        </w:rPr>
+      </w:pPr>
+      <w:r>
+        <w:rPr>
+          <w:sz w:val="56"/>
+          <w:szCs w:val="56"/>
+        </w:rPr>
+        <w:t>NEXT PAGE IS EMPTY</w:t>
+      </w:r>
+    </w:p>
+    <w:p>
+      <w:pPr>
+        <w:rPr>
+          <w:sz w:val="56"/>
+          <w:szCs w:val="56"/>
+        </w:rPr>
+      </w:pPr>
       <w:r>
         <w:rPr>
           <w:sz w:val="56"/>
@@ -54,111 +155,8 @@
           <w:szCs w:val="56"/>
         </w:rPr>
       </w:pPr>
-      <w:r>
-        <w:rPr>
-          <w:sz w:val="56"/>
-          <w:szCs w:val="56"/>
-        </w:rPr>
-        <w:lastRenderedPageBreak/>
-        <w:t>2</w:t>
-      </w:r>
-    </w:p>
-    <w:p>
-      <w:pPr>
-        <w:rPr>
-          <w:sz w:val="56"/>
-          <w:szCs w:val="56"/>
-        </w:rPr>
-      </w:pPr>
-      <w:r>
-        <w:rPr>
-          <w:sz w:val="56"/>
-          <w:szCs w:val="56"/>
-        </w:rPr>
-        <w:br w:type="page"/>
-      </w:r>
-    </w:p>
-    <w:p>
-      <w:pPr>
-        <w:rPr>
-          <w:sz w:val="56"/>
-          <w:szCs w:val="56"/>
-        </w:rPr>
-      </w:pPr>
-      <w:r>
-        <w:rPr>
-          <w:sz w:val="56"/>
-          <w:szCs w:val="56"/>
-        </w:rPr>
-        <w:lastRenderedPageBreak/>
-        <w:t>3</w:t>
-      </w:r>
-    </w:p>
-    <w:p>
-      <w:pPr>
-        <w:rPr>
-          <w:sz w:val="56"/>
-          <w:szCs w:val="56"/>
-        </w:rPr>
-      </w:pPr>
-      <w:r>
-        <w:rPr>
-          <w:sz w:val="56"/>
-          <w:szCs w:val="56"/>
-        </w:rPr>
-        <w:br w:type="page"/>
-      </w:r>
-    </w:p>
-    <w:p>
-      <w:pPr>
-        <w:rPr>
-          <w:sz w:val="56"/>
-          <w:szCs w:val="56"/>
-        </w:rPr>
-      </w:pPr>
-      <w:r>
-        <w:rPr>
-          <w:sz w:val="56"/>
-          <w:szCs w:val="56"/>
-        </w:rPr>
-        <w:lastRenderedPageBreak/>
-        <w:t>4</w:t>
-      </w:r>
-    </w:p>
-    <w:p>
-      <w:pPr>
-        <w:rPr>
-          <w:sz w:val="56"/>
-          <w:szCs w:val="56"/>
-        </w:rPr>
-      </w:pPr>
-      <w:r>
-        <w:rPr>
-          <w:sz w:val="56"/>
-          <w:szCs w:val="56"/>
-        </w:rPr>
-        <w:br w:type="page"/>
-      </w:r>
-    </w:p>
-    <w:p>
-      <w:pPr>
-        <w:rPr>
-          <w:sz w:val="56"/>
-          <w:szCs w:val="56"/>
-        </w:rPr>
-      </w:pPr>
-      <w:r>
-        <w:rPr>
-          <w:sz w:val="56"/>
-          <w:szCs w:val="56"/>
-        </w:rPr>
-        <w:lastRenderedPageBreak/>
-        <w:t>5</w:t>
-      </w:r>
     </w:p>
     <w:sectPr>
-      <w:headerReference w:type="default" r:id="rId6"/>
-      <w:footerReference w:type="default" r:id="rId7"/>
       <w:pgSz w:w="12240" w:h="15840"/>
       <w:pgMar w:top="1440" w:right="1440" w:bottom="1440" w:left="1440" w:header="720" w:footer="720" w:gutter="0"/>
       <w:cols w:space="720"/>
@@ -193,19 +191,6 @@
 </w:endnotes>
 </file>
 
-<file path=word/footer1.xml><?xml version="1.0" encoding="utf-8"?>
-<w:ftr xmlns:wpc="http://schemas.microsoft.com/office/word/2010/wordprocessingCanvas" xmlns:cx="http://schemas.microsoft.com/office/drawing/2014/chartex" xmlns:cx1="http://schemas.microsoft.com/office/drawing/2015/9/8/chartex" xmlns:cx2="http://schemas.microsoft.com/office/drawing/2015/10/21/chartex" xmlns:cx3="http://schemas.microsoft.com/office/drawing/2016/5/9/chartex" xmlns:cx4="http://schemas.microsoft.com/office/drawing/2016/5/10/chartex" xmlns:cx5="http://schemas.microsoft.com/office/drawing/2016/5/11/chartex" xmlns:cx6="http://schemas.microsoft.com/office/drawing/2016/5/12/chartex" xmlns:cx7="http://schemas.microsoft.com/office/drawing/2016/5/13/chartex" xmlns:cx8="http://schemas.microsoft.com/office/drawing/2016/5/14/chartex" xmlns:mc="http://schemas.openxmlformats.org/markup-compatibility/2006" xmlns:aink="http://schemas.microsoft.com/office/drawing/2016/ink" xmlns:am3d="http://schemas.microsoft.com/office/drawing/2017/model3d" xmlns:o="urn:schemas-microsoft-com:office:office" xmlns:oel="http://schemas.microsoft.com/office/2019/extlst" xmlns:r="http://schemas.openxmlformats.org/officeDocument/2006/relationships" xmlns:m="http://schemas.openxmlformats.org/officeDocument/2006/math" xmlns:v="urn:schemas-microsoft-com:vml" xmlns:wp14="http://schemas.microsoft.com/office/word/2010/wordprocessingDrawing" xmlns:wp="http://schemas.openxmlformats.org/drawingml/2006/wordprocessingDrawing" xmlns:w10="urn:schemas-microsoft-com:office:word" xmlns:w="http://schemas.openxmlformats.org/wordprocessingml/2006/main" xmlns:w14="http://schemas.microsoft.com/office/word/2010/wordml" xmlns:w15="http://schemas.microsoft.com/office/word/2012/wordml" xmlns:w16cex="http://schemas.microsoft.com/office/word/2018/wordml/cex" xmlns:w16cid="http://schemas.microsoft.com/office/word/2016/wordml/cid" xmlns:w16="http://schemas.microsoft.com/office/word/2018/wordml" xmlns:w16du="http://schemas.microsoft.com/office/word/2023/wordml/word16du" xmlns:w16sdtdh="http://schemas.microsoft.com/office/word/2020/wordml/sdtdatahash" xmlns:w16sdtfl="http://schemas.microsoft.com/office/word/2024/wordml/sdtformatlock" xmlns:w16se="http://schemas.microsoft.com/office/word/2015/wordml/symex" xmlns:wpg="http://schemas.microsoft.com/office/word/2010/wordprocessingGroup" xmlns:wpi="http://schemas.microsoft.com/office/word/2010/wordprocessingInk" xmlns:wne="http://schemas.microsoft.com/office/word/2006/wordml" xmlns:wps="http://schemas.microsoft.com/office/word/2010/wordprocessingShape" mc:Ignorable="w14 w15 w16se w16cid w16 w16cex w16sdtdh w16sdtfl w16du wp14">
-  <w:p>
-    <w:pPr>
-      <w:pStyle w:val="Footer"/>
-    </w:pPr>
-    <w:r>
-      <w:t>TEST</w:t>
-    </w:r>
-  </w:p>
-</w:ftr>
-</file>
-
 <file path=word/footnotes.xml><?xml version="1.0" encoding="utf-8"?>
 <w:footnotes xmlns:wpc="http://schemas.microsoft.com/office/word/2010/wordprocessingCanvas" xmlns:cx="http://schemas.microsoft.com/office/drawing/2014/chartex" xmlns:cx1="http://schemas.microsoft.com/office/drawing/2015/9/8/chartex" xmlns:cx2="http://schemas.microsoft.com/office/drawing/2015/10/21/chartex" xmlns:cx3="http://schemas.microsoft.com/office/drawing/2016/5/9/chartex" xmlns:cx4="http://schemas.microsoft.com/office/drawing/2016/5/10/chartex" xmlns:cx5="http://schemas.microsoft.com/office/drawing/2016/5/11/chartex" xmlns:cx6="http://schemas.microsoft.com/office/drawing/2016/5/12/chartex" xmlns:cx7="http://schemas.microsoft.com/office/drawing/2016/5/13/chartex" xmlns:cx8="http://schemas.microsoft.com/office/drawing/2016/5/14/chartex" xmlns:mc="http://schemas.openxmlformats.org/markup-compatibility/2006" xmlns:aink="http://schemas.microsoft.com/office/drawing/2016/ink" xmlns:am3d="http://schemas.microsoft.com/office/drawing/2017/model3d" xmlns:o="urn:schemas-microsoft-com:office:office" xmlns:oel="http://schemas.microsoft.com/office/2019/extlst" xmlns:r="http://schemas.openxmlformats.org/officeDocument/2006/relationships" xmlns:m="http://schemas.openxmlformats.org/officeDocument/2006/math" xmlns:v="urn:schemas-microsoft-com:vml" xmlns:wp14="http://schemas.microsoft.com/office/word/2010/wordprocessingDrawing" xmlns:wp="http://schemas.openxmlformats.org/drawingml/2006/wordprocessingDrawing" xmlns:w10="urn:schemas-microsoft-com:office:word" xmlns:w="http://schemas.openxmlformats.org/wordprocessingml/2006/main" xmlns:w14="http://schemas.microsoft.com/office/word/2010/wordml" xmlns:w15="http://schemas.microsoft.com/office/word/2012/wordml" xmlns:w16cex="http://schemas.microsoft.com/office/word/2018/wordml/cex" xmlns:w16cid="http://schemas.microsoft.com/office/word/2016/wordml/cid" xmlns:w16="http://schemas.microsoft.com/office/word/2018/wordml" xmlns:w16du="http://schemas.microsoft.com/office/word/2023/wordml/word16du" xmlns:w16sdtdh="http://schemas.microsoft.com/office/word/2020/wordml/sdtdatahash" xmlns:w16sdtfl="http://schemas.microsoft.com/office/word/2024/wordml/sdtformatlock" xmlns:w16se="http://schemas.microsoft.com/office/word/2015/wordml/symex" xmlns:wpg="http://schemas.microsoft.com/office/word/2010/wordprocessingGroup" xmlns:wpi="http://schemas.microsoft.com/office/word/2010/wordprocessingInk" xmlns:wne="http://schemas.microsoft.com/office/word/2006/wordml" xmlns:wps="http://schemas.microsoft.com/office/word/2010/wordprocessingShape" mc:Ignorable="w14 w15 w16se w16cid w16 w16cex w16sdtdh w16sdtfl w16du wp14">
   <w:footnote w:type="separator" w:id="-1">
@@ -229,19 +214,6 @@
     </w:p>
   </w:footnote>
 </w:footnotes>
-</file>
-
-<file path=word/header1.xml><?xml version="1.0" encoding="utf-8"?>
-<w:hdr xmlns:wpc="http://schemas.microsoft.com/office/word/2010/wordprocessingCanvas" xmlns:cx="http://schemas.microsoft.com/office/drawing/2014/chartex" xmlns:cx1="http://schemas.microsoft.com/office/drawing/2015/9/8/chartex" xmlns:cx2="http://schemas.microsoft.com/office/drawing/2015/10/21/chartex" xmlns:cx3="http://schemas.microsoft.com/office/drawing/2016/5/9/chartex" xmlns:cx4="http://schemas.microsoft.com/office/drawing/2016/5/10/chartex" xmlns:cx5="http://schemas.microsoft.com/office/drawing/2016/5/11/chartex" xmlns:cx6="http://schemas.microsoft.com/office/drawing/2016/5/12/chartex" xmlns:cx7="http://schemas.microsoft.com/office/drawing/2016/5/13/chartex" xmlns:cx8="http://schemas.microsoft.com/office/drawing/2016/5/14/chartex" xmlns:mc="http://schemas.openxmlformats.org/markup-compatibility/2006" xmlns:aink="http://schemas.microsoft.com/office/drawing/2016/ink" xmlns:am3d="http://schemas.microsoft.com/office/drawing/2017/model3d" xmlns:o="urn:schemas-microsoft-com:office:office" xmlns:oel="http://schemas.microsoft.com/office/2019/extlst" xmlns:r="http://schemas.openxmlformats.org/officeDocument/2006/relationships" xmlns:m="http://schemas.openxmlformats.org/officeDocument/2006/math" xmlns:v="urn:schemas-microsoft-com:vml" xmlns:wp14="http://schemas.microsoft.com/office/word/2010/wordprocessingDrawing" xmlns:wp="http://schemas.openxmlformats.org/drawingml/2006/wordprocessingDrawing" xmlns:w10="urn:schemas-microsoft-com:office:word" xmlns:w="http://schemas.openxmlformats.org/wordprocessingml/2006/main" xmlns:w14="http://schemas.microsoft.com/office/word/2010/wordml" xmlns:w15="http://schemas.microsoft.com/office/word/2012/wordml" xmlns:w16cex="http://schemas.microsoft.com/office/word/2018/wordml/cex" xmlns:w16cid="http://schemas.microsoft.com/office/word/2016/wordml/cid" xmlns:w16="http://schemas.microsoft.com/office/word/2018/wordml" xmlns:w16du="http://schemas.microsoft.com/office/word/2023/wordml/word16du" xmlns:w16sdtdh="http://schemas.microsoft.com/office/word/2020/wordml/sdtdatahash" xmlns:w16sdtfl="http://schemas.microsoft.com/office/word/2024/wordml/sdtformatlock" xmlns:w16se="http://schemas.microsoft.com/office/word/2015/wordml/symex" xmlns:wpg="http://schemas.microsoft.com/office/word/2010/wordprocessingGroup" xmlns:wpi="http://schemas.microsoft.com/office/word/2010/wordprocessingInk" xmlns:wne="http://schemas.microsoft.com/office/word/2006/wordml" xmlns:wps="http://schemas.microsoft.com/office/word/2010/wordprocessingShape" mc:Ignorable="w14 w15 w16se w16cid w16 w16cex w16sdtdh w16sdtfl w16du wp14">
-  <w:p>
-    <w:pPr>
-      <w:pStyle w:val="Header"/>
-    </w:pPr>
-    <w:r>
-      <w:t>TEST</w:t>
-    </w:r>
-  </w:p>
-</w:hdr>
 </file>
 
 <file path=word/styles.xml><?xml version="1.0" encoding="utf-8"?>

</xml_diff>

<commit_message>
Fix: missing handle odd pages + duplex
</commit_message>
<xml_diff>
--- a/test/test.docx
+++ b/test/test.docx
@@ -155,6 +155,45 @@
           <w:szCs w:val="56"/>
         </w:rPr>
       </w:pPr>
+      <w:r>
+        <w:rPr>
+          <w:sz w:val="56"/>
+          <w:szCs w:val="56"/>
+        </w:rPr>
+        <w:lastRenderedPageBreak/>
+        <w:t>2</w:t>
+      </w:r>
+    </w:p>
+    <w:p>
+      <w:pPr>
+        <w:rPr>
+          <w:sz w:val="56"/>
+          <w:szCs w:val="56"/>
+        </w:rPr>
+      </w:pPr>
+      <w:r>
+        <w:rPr>
+          <w:sz w:val="56"/>
+          <w:szCs w:val="56"/>
+        </w:rPr>
+        <w:br w:type="page"/>
+      </w:r>
+    </w:p>
+    <w:p>
+      <w:pPr>
+        <w:rPr>
+          <w:sz w:val="56"/>
+          <w:szCs w:val="56"/>
+        </w:rPr>
+      </w:pPr>
+      <w:r>
+        <w:rPr>
+          <w:sz w:val="56"/>
+          <w:szCs w:val="56"/>
+        </w:rPr>
+        <w:lastRenderedPageBreak/>
+        <w:t>3</w:t>
+      </w:r>
     </w:p>
     <w:sectPr>
       <w:pgSz w:w="12240" w:h="15840"/>

</xml_diff>